<commit_message>
Refs #1: Prepare Roshd proposal
</commit_message>
<xml_diff>
--- a/assets/park/Hormuz-Cost-Effective-Draft-01.docx
+++ b/assets/park/Hormuz-Cost-Effective-Draft-01.docx
@@ -1429,23 +1429,7 @@
           <w:rtl w:val="true"/>
           <w:lang w:bidi="fa-IR"/>
         </w:rPr>
-        <w:t>زمينه فعاليت</w:t>
-      </w:r>
-      <w:r>
-        <w:rPr>
-          <w:rFonts w:cs="B Zar" w:hint="cs"/>
-          <w:rtl w:val="true"/>
-          <w:lang w:bidi="fa-IR"/>
-        </w:rPr>
-        <w:t>:</w:t>
-      </w:r>
-      <w:r>
-        <w:rPr>
-          <w:rFonts w:cs="B Zar" w:hint="cs"/>
-          <w:rtl w:val="true"/>
-          <w:lang w:bidi="fa-IR"/>
-        </w:rPr>
-        <w:t xml:space="preserve"> طراحی و ساخت مرکز داده کوچک و کم‌هزینه؛ میزبانی و خدمات ارتباطی</w:t>
+        <w:t xml:space="preserve">زمينه فعاليت: طراحی و ساخت زیرساخت کم‌هزینه مرکز داده و ارائه خدمات میزبانی و تلفن اینترنتی</w:t>
       </w:r>
     </w:p>
     <w:p>
@@ -3393,23 +3377,7 @@
           <w:rtl w:val="true"/>
           <w:lang w:bidi="fa-IR"/>
         </w:rPr>
-        <w:t>زمينه فعاليت</w:t>
-      </w:r>
-      <w:r>
-        <w:rPr>
-          <w:rFonts w:cs="B Zar" w:hint="cs"/>
-          <w:rtl w:val="true"/>
-          <w:lang w:bidi="fa-IR"/>
-        </w:rPr>
-        <w:t>:</w:t>
-      </w:r>
-      <w:r>
-        <w:rPr>
-          <w:rFonts w:cs="B Zar" w:hint="cs"/>
-          <w:rtl w:val="true"/>
-          <w:lang w:bidi="fa-IR"/>
-        </w:rPr>
-        <w:t xml:space="preserve"> زیرساخت فناوری اطلاعات و ساخت تجهیزات کم‌هزینه مرکز داده</w:t>
+        <w:t xml:space="preserve">زمينه فعاليت: زیرساخت مرکز داده کوچک؛ سرور اختصاصی و مجازی، هم‌مکانی و تلفن اینترنتی</w:t>
       </w:r>
     </w:p>
     <w:p>
@@ -4528,7 +4496,7 @@
           <w:rtl w:val="true"/>
           <w:lang w:bidi="fa-IR"/>
         </w:rPr>
-        <w:t xml:space="preserve">عضو اول: ۱۵ سال آزادکاری پایتون، ۴ سال مدیریت سیستم شبکه‌های مجازی امن و ۲ سال مدیریت مزرعه استخراج رمز ارز؛ تجربه طراحی و ساخت سامانه‌های مکانیکی و الکتریکی.</w:t>
+        <w:t xml:space="preserve">عضو اول، با سابقه ۱۵ سال برنامه‌نویسی پایتون، ۴ سال مدیریت شبکه‌های مجازی امن و ۲ سال اداره مزرعه استخراج، مسئول راه‌اندازی سرورها، شبکه و نرم‌افزار پایش خواهد بود.</w:t>
       </w:r>
     </w:p>
     <w:p>
@@ -4552,7 +4520,7 @@
           <w:rtl w:val="true"/>
           <w:lang w:bidi="fa-IR"/>
         </w:rPr>
-        <w:t xml:space="preserve">عضو دوم: ۱۰ سال مدیریت فروش و سابقه کارشناسی سیستم‌های ارت و حفاظت برق؛ تجربه طراحی مکانیکی و تأمین تجهیزات. مستندات سوابق پس از تأیید اعضا ضمیمه می‌شود.</w:t>
+        <w:t xml:space="preserve">عضو دوم، با سابقه ۱۰ سال مدیریت فروش و کار در زمینه ارت و حفاظت برق، در طراحی مکانیکی، تأمین قطعات و جذب مشتری همکاری می‌کند. سوابق و مدارک اعضا به فرم پیوست خواهد شد.</w:t>
       </w:r>
     </w:p>
     <w:p>
@@ -5005,7 +4973,7 @@
           <w:rtl w:val="true"/>
           <w:lang w:bidi="fa-IR"/>
         </w:rPr>
-        <w:t xml:space="preserve">فعالیت‌های منتخب: کسب دانش فنی، طراحی و تولید نمونه، توسعه محصول و بازاریابی خدمات مرکز داده کوچک و اقتصادی.</w:t>
+        <w:t xml:space="preserve">کار اصلی هسته در دوره پیش‌رشد، طراحی و ساخت نمونه تجهیزات کم‌هزینه، آزمایش آن‌ها در محل و آماده‌سازی خدمات میزبانی برای فروش است.</w:t>
       </w:r>
     </w:p>
     <w:p>
@@ -5143,7 +5111,7 @@
           <w:rtl w:val="true"/>
           <w:lang w:bidi="fa-IR"/>
         </w:rPr>
-        <w:t xml:space="preserve">ایده محوری، ساخت یک مرکز داده کوچک با سرمایه اولیه محدود و توسعه مرحله‌ای است. تجهیزات بازسازی‌شده، ساخت داخلی زیرسامانه‌ها و نرم‌افزارهای متن‌باز، هزینه راه‌اندازی و نگهداری را کاهش می‌دهد.</w:t>
+        <w:t xml:space="preserve">در هرمز می‌خواهیم هزینه ایجاد یک مرکز داده کوچک را با ساخت بخشی از تجهیزات و استفاده دوباره از قطعات سالم کاهش دهیم. شروع کار با ظرفیت محدود است؛ رک‌ها به‌تدریج و متناسب با مشتری تجهیز می‌شوند تا سرمایه در تجهیزات بلااستفاده نماند.</w:t>
       </w:r>
     </w:p>
     <w:p>
@@ -5167,7 +5135,7 @@
           <w:rtl w:val="true"/>
           <w:lang w:bidi="fa-IR"/>
         </w:rPr>
-        <w:t xml:space="preserve">مبنای فنی: موازنه حرارتی، گردش هوا، اندازه‌گیری دما و رطوبت، حفاظت برق و مجازی‌سازی. پایلوت با یک رک و تعداد محدود سرور آغاز می‌شود و توسعه تابع آزمون بار و تقاضای واقعی است.</w:t>
+        <w:t xml:space="preserve">فضای مبنا، اتاقی به ابعاد ۴٫۵ در ۴ متر برای چهار رک ۴۲ یونیت است. سقف بار کل مجموعه، شامل سرورها و تجهیزات جانبی، ۵۰ کیلووات در نظر گرفته شده است. برق ورودی سه‌فاز ۲۲۰ ولت است؛ پیش از انتخاب UPS باید مشخص شود این عدد ولتاژ فاز به نول است یا بین دو فاز.</w:t>
       </w:r>
     </w:p>
     <w:p>
@@ -5191,7 +5159,7 @@
           <w:rtl w:val="true"/>
           <w:lang w:bidi="fa-IR"/>
         </w:rPr>
-        <w:t xml:space="preserve">مدل درآمدی بر چهار خدمت استوار است: اجاره سرور اختصاصی، فروش سرور مجازی، هم‌مکانی تجهیزات مشتری و فروش خدمات تلفن مبتنی بر اینترنت. نصب و پشتیبانی هر خدمت جداگانه قیمت‌گذاری می‌شود.</w:t>
+        <w:t xml:space="preserve">درآمد مجموعه از اجاره سرور اختصاصی، فروش سرور مجازی، اجاره فضای رک به صاحبان تجهیزات و راه‌اندازی و پشتیبانی تلفن اینترنتی تأمین می‌شود. در دوره نخست، فروش را از کسب‌وکارهای کوچک و شرکت‌های نرم‌افزاری ایلام آغاز می‌کنیم.</w:t>
       </w:r>
     </w:p>
     <w:p>
@@ -5215,7 +5183,7 @@
           <w:rtl w:val="true"/>
           <w:lang w:bidi="fa-IR"/>
         </w:rPr>
-        <w:t xml:space="preserve">سرور اختصاصی بر اساس سخت‌افزار و مدت اجاره؛ سرور مجازی بر اساس پردازنده، حافظه، دیسک و ترافیک؛ هم‌مکانی بر اساس یونیت، توان و ارتباط؛ تلفن اینترنتی بر اساس نصب، تعداد داخلی و پشتیبانی ماهانه فروخته می‌شود.</w:t>
+        <w:t xml:space="preserve">اجاره سرور و فضای رک به‌صورت ماهانه خواهد بود. منابع پردازنده، حافظه، دیسک و ترافیک، مبنای بسته‌های سرور مجازی است. در هم‌مکانی، یونیت و برق مصرفی محاسبه می‌شود. برای تلفن اینترنتی، هزینه نصب و حق پشتیبانی دوره‌ای بر اساس تعداد داخلی و دامنه کار دریافت می‌کنیم.</w:t>
       </w:r>
     </w:p>
     <w:p>
@@ -5239,7 +5207,7 @@
           <w:rtl w:val="true"/>
           <w:lang w:bidi="fa-IR"/>
         </w:rPr>
-        <w:t xml:space="preserve">برای کاهش هزینه، سطح افزونگی و برخی امکانات مراکز داده بزرگ محدود می‌شود. سطح خدمت بر مبنای نتایج پایلوت اعلام خواهد شد؛ حفاظت برق، ایمنی افراد، امنیت داده و نگهداری منظم در طرح باقی می‌ماند.</w:t>
+        <w:t xml:space="preserve">برای ارزان‌تر شدن طرح، در شروع از افزونگی کامل مراکز بزرگ صرف‌نظر می‌کنیم و میزان تعهد خدمات را مطابق امکانات واقعی می‌نویسیم. کاهش هزینه از ساخت و تعمیر تجهیزات و اجرای کار توسط تیم به دست می‌آید؛ حفاظت برق، امکان خروج از اتاق و نسخه پشتیبان داده‌ها همچنان ضروری است.</w:t>
       </w:r>
     </w:p>
     <w:p>
@@ -5315,7 +5283,7 @@
           <w:rtl w:val="true"/>
           <w:lang w:bidi="fa-IR"/>
         </w:rPr>
-        <w:t xml:space="preserve">۱) ساخت سامانه دست‌ساز تشخیص و اطفای حریق با حسگر دود و حرارت، هشدار و کنترل؛ انتخاب بخش اطفا و پذیرش نمونه با ارزیابی متخصص ایمنی انجام می‌شود.</w:t>
+        <w:t xml:space="preserve">کف موزاییکی را با پرایمر، شبکه نوار مسی و لایه‌های اپوکسی و گرافیتِ ساخته‌شده در کارگاه می‌پوشانیم. ابتدا نمونه کوچک می‌سازیم و مقاومت و دوام آن را می‌سنجیم. اتصال کف و رک‌ها به ارت مشترک ساختمان انجام می‌شود؛ انتخاب میله، حلقه یا چاه ارت پس از آزمایش محل خواهد بود.</w:t>
       </w:r>
     </w:p>
     <w:p>
@@ -5339,7 +5307,7 @@
           <w:rtl w:val="true"/>
           <w:lang w:bidi="fa-IR"/>
         </w:rPr>
-        <w:t xml:space="preserve">۲) اجرای دست‌ساز پوشش نهایی کف با سطح آنتی‌استاتیک و مسیر تخلیه به زمین؛ ارزیابی کیفیت با اندازه‌گیری مقاومت و دوام پوشش.</w:t>
+        <w:t xml:space="preserve">برای چهار رک، هوای سرد از جلو وارد و هوای گرم از پشت جمع می‌شود. قاب فیلتر قابل استفاده مجدد است و لایه‌های آن را از مواد اولیه می‌سازیم. ساخت مبدل با رادیاتور خودرو و قطعات ماشین لباس‌شویی نیز آزمایش می‌شود؛ رادیاتور به‌تنهایی سرما تولید نمی‌کند و منبع دفع گرما باید جداگانه تعیین شود.</w:t>
       </w:r>
     </w:p>
     <w:p>
@@ -5363,7 +5331,7 @@
           <w:rtl w:val="true"/>
           <w:lang w:bidi="fa-IR"/>
         </w:rPr>
-        <w:t xml:space="preserve">۳) ساخت سامانه پایش با حسگر دما و رطوبت، ثبت داده و هشدار؛ ساخت فیلتر هوای قابل تعویض برای کاهش گردوغبار و بررسی افت جریان هوا.</w:t>
+        <w:t xml:space="preserve">دما و رطوبت در سه ارتفاع ورودی هر رک، جمعاً ۱۲ نقطه، ثبت می‌شود. نمونه آردوینو و حسگر روی یک رک آزمایش و سپس به ماشین مجازی پایش متصل می‌شود. حسگر شبکه‌ای FTA3070-21 نیز برای مقایسه در نظر گرفته شده، اما هنوز قیمت قطعی ندارد. نمایش سوابق و ارسال هشدار را خودمان برنامه‌نویسی می‌کنیم.</w:t>
       </w:r>
     </w:p>
     <w:p>
@@ -5387,7 +5355,7 @@
           <w:rtl w:val="true"/>
           <w:lang w:bidi="fa-IR"/>
         </w:rPr>
-        <w:t xml:space="preserve">۴) ساخت سرمایش اقتصادی با رادیاتور خودرو با تأمین اجاره‌ای و قطعات بازیافتی ماشین لباس‌شویی، از جمله پمپ مناسب؛ آزمون دفع گرما، نشتی و مصرف برق. شرایط تأمین قطعات نیازمند تأیید است.</w:t>
+        <w:t xml:space="preserve">اعلام دود با دو آشکارساز رله‌دار، یک رابط اترنت و آژیر شروع می‌شود؛ در صورت نیاز آشکارساز سوم اضافه خواهد شد. تغذیه از UPS مشترک است و ماشین مجازی، تماس هشدار را برقرار می‌کند. آژیر باید بدون وابستگی به ماشین مجازی کار کند. اطفا با مخزن، لوله و نازل جداگانه طراحی می‌شود و فرمان تخلیه به نرم‌افزار پایش سپرده نمی‌شود.</w:t>
       </w:r>
     </w:p>
     <w:p>
@@ -5411,7 +5379,7 @@
           <w:rtl w:val="true"/>
           <w:lang w:bidi="fa-IR"/>
         </w:rPr>
-        <w:t xml:space="preserve">۵) ساخت برق پشتیبان با باتری خودرو، شارژر و مبدل متناسب با بار؛ آزمون زمان پشتیبانی، عمر باتری و تهویه. چند پنل خورشیدی گزینه توسعه است. نوآوری در یکپارچه‌سازی کم‌هزینه و قابل تعمیر اجزاست و با آزمون اثبات می‌شود.</w:t>
+        <w:t xml:space="preserve">در برق پشتیبان، هدف ساخت مجموعه‌ای قابل تعمیر از باتری، شارژر، مبدل و تابلو حفاظت است. باتری خودرو گزینه آزمایشی طرح است؛ انتخاب نهایی به زمان پشتیبانی، رفتار تخلیه و هزینه تعویض بستگی دارد. نمونه ابتدا با بار محدود آزمایش می‌شود. چند پنل خورشیدی را پس از روشن شدن مصرف و هزینه مرحله اول بررسی می‌کنیم.</w:t>
       </w:r>
     </w:p>
     <w:p>
@@ -5487,7 +5455,7 @@
           <w:rtl w:val="true"/>
           <w:lang w:bidi="fa-IR"/>
         </w:rPr>
-        <w:t xml:space="preserve">ماه اول: بررسی محل، بار برق و حرارت، استعلام تجهیزات و مصاحبه با مشتری؛ تعیین سقف بودجه و سطح خدمت.</w:t>
+        <w:t xml:space="preserve">ماه اول: برداشت محل و مسیر کابل و کانال، آزمایش ارت موجود، اندازه‌گیری بار و تعیین سهم سرمایش از برق کل؛ دریافت قیمت قطعات و گفتگو با نخستین مشتریان.</w:t>
       </w:r>
     </w:p>
     <w:p>
@@ -5511,7 +5479,7 @@
           <w:rtl w:val="true"/>
           <w:lang w:bidi="fa-IR"/>
         </w:rPr>
-        <w:t xml:space="preserve">ماه دوم: طراحی و ساخت نمونه‌های کف، پایش، فیلتر، سرمایش، برق پشتیبان و تشخیص و اطفای حریق.</w:t>
+        <w:t xml:space="preserve">ماه دوم: ساخت نمونه پوشش کف، فیلتر و پایش یک رک؛ آزمایش اتصال حسگرها و دو آشکارساز دود به ماشین مجازی. زمان کار شخصی در برنامه خرید و اجرا لحاظ می‌شود.</w:t>
       </w:r>
     </w:p>
     <w:p>
@@ -5535,7 +5503,7 @@
           <w:rtl w:val="true"/>
           <w:lang w:bidi="fa-IR"/>
         </w:rPr>
-        <w:t xml:space="preserve">ماه سوم: تجهیز یک رک، نصب سرورها و شبکه و راه‌اندازی مجازی‌سازی و تلفن اینترنتی.</w:t>
+        <w:t xml:space="preserve">ماه سوم: اجرای کف و ارت، نصب کانال و فیلتر، دوربین و کنترل ورودی؛ تکمیل طراحی برق پشتیبان و اطفا بر مبنای نتایج مرحله قبل و امکانات محل.</w:t>
       </w:r>
     </w:p>
     <w:p>
@@ -5559,7 +5527,7 @@
           <w:rtl w:val="true"/>
           <w:lang w:bidi="fa-IR"/>
         </w:rPr>
-        <w:t xml:space="preserve">ماه چهارم: آزمون بار، گرما، قطع برق، هشدار، بازیابی داده و امنیت؛ اصلاح نمونه‌های ناموفق.</w:t>
+        <w:t xml:space="preserve">ماه چهارم: تجهیز نخستین رک و آزمون یکپارچه برق، گردش هوا، هشدار، خروج اضطراری و بازیابی داده؛ پیش از ورود مشتری، ۷۲ ساعت کار پیوسته زیر بار آزمایشی ثبت می‌شود.</w:t>
       </w:r>
     </w:p>
     <w:p>
@@ -5583,7 +5551,7 @@
           <w:rtl w:val="true"/>
           <w:lang w:bidi="fa-IR"/>
         </w:rPr>
-        <w:t xml:space="preserve">ماه پنجم و ششم: اجرای پایلوت با هدف جذب ۳ مشتری، تدوین تعرفه و قرارداد و آغاز فروش تدریجی.</w:t>
+        <w:t xml:space="preserve">ماه پنجم و ششم: عرضه سرور اختصاصی و مجازی، هم‌مکانی و تلفن اینترنتی با هدف جذب سه مشتری نخست؛ اصلاح قیمت و روش پشتیبانی بر اساس هزینه و تجربه واقعی.</w:t>
       </w:r>
     </w:p>
     <w:p>
@@ -5607,7 +5575,7 @@
           <w:rtl w:val="true"/>
           <w:lang w:bidi="fa-IR"/>
         </w:rPr>
-        <w:t xml:space="preserve">معیار پذیرش: هزینه ساخت در سقف بودجه، پایداری دما در بار آزمون، زمان برق پشتیبان اندازه‌گیری‌شده و ثبت و رسیدگی به رخدادها؛ مقادیر هدف پس از امکان‌سنجی تعیین می‌شود.</w:t>
+        <w:t xml:space="preserve">آزمایش خاک، خشک شدن کف و تأمین قطعات ممکن است روی زمان اجرا اثر بگذارد. خرید UPS و اطفا پس از نهایی شدن طراحی انجام می‌شود؛ پر کردن هر چهار رک شرط شروع فروش نیست.</w:t>
       </w:r>
     </w:p>
     <w:p>
@@ -5683,7 +5651,7 @@
           <w:rtl w:val="true"/>
           <w:lang w:bidi="fa-IR"/>
         </w:rPr>
-        <w:t xml:space="preserve">بازار آغازین: شرکت‌های نرم‌افزاری، کسب‌وکارهای کوچک، آزادکاران و مجموعه‌های نیازمند میزبانی مقرون‌به‌صرفه یا مرکز تلفن اینترنتی در ایلام و سپس سایر نقاط کشور.</w:t>
+        <w:t xml:space="preserve">مشتری نخست ما شرکتی است که به سرور یا مرکز تلفن نیاز دارد، ولی خرید و نگهداری اتاق سرور برایش به‌صرفه نیست. شرکت‌های نرم‌افزاری، فروشگاه‌ها و دفترهای خدماتی ایلام، نقطه شروع مناسبی برای مذاکره هستند.</w:t>
       </w:r>
     </w:p>
     <w:p>
@@ -5707,7 +5675,7 @@
           <w:rtl w:val="true"/>
           <w:lang w:bidi="fa-IR"/>
         </w:rPr>
-        <w:t xml:space="preserve">نیاز مشتری: دسترسی به سرور و فضای میزبانی با هزینه کمتر از ساخت اتاق سرور اختصاصی و دریافت پشتیبانی نزدیک و پاسخ‌گو.</w:t>
+        <w:t xml:space="preserve">بعضی مشتریان سرور خود را دارند و فقط فضا، برق، ارتباط و رسیدگی فنی می‌خواهند. برای گروه دیگر، سرور مجازی با هزینه ماهانه مشخص و امکان افزایش منابع عرضه می‌کنیم.</w:t>
       </w:r>
     </w:p>
     <w:p>
@@ -5731,7 +5699,7 @@
           <w:rtl w:val="true"/>
           <w:lang w:bidi="fa-IR"/>
         </w:rPr>
-        <w:t xml:space="preserve">رقبا: مراکز داده بزرگ، فروشندگان سرور مجازی و اختصاصی و مجریان اتاق سرور و تلفن اینترنتی. بررسی تعرفه و کیفیت رقبا در مرحله اعتبارسنجی انجام می‌شود.</w:t>
+        <w:t xml:space="preserve">رقبای ما مراکز داده بزرگ، فروشندگان سرور مجازی و مجریان محلی شبکه و تلفن اینترنتی هستند. پیش از تعیین تعرفه، قیمت چند خدمت هم‌سطح و شرایط پشتیبانی آن‌ها را مقایسه می‌کنیم.</w:t>
       </w:r>
     </w:p>
     <w:p>
@@ -5755,7 +5723,7 @@
           <w:rtl w:val="true"/>
           <w:lang w:bidi="fa-IR"/>
         </w:rPr>
-        <w:t xml:space="preserve">مزیت رقبای بزرگ: مقیاس، ارتباط و افزونگی بیشتر؛ محدودیت احتمالی برای مشتری کوچک: هزینه خدمات و انعطاف کمتر در سفارش‌های محدود؛ نیازمند بررسی با مصاحبه و استعلام.</w:t>
+        <w:t xml:space="preserve">مراکز بزرگ در ظرفیت ارتباط و برق پشتیبان قوی‌ترند. مزیت قابل پیگیری هرمز، هزینه کمتر اجرای زیرساخت، دسترسی مستقیم مشتری به تیم فنی و امکان رسیدگی به سفارش‌های کوچک است.</w:t>
       </w:r>
     </w:p>
     <w:p>
@@ -5779,7 +5747,7 @@
           <w:rtl w:val="true"/>
           <w:lang w:bidi="fa-IR"/>
         </w:rPr>
-        <w:t xml:space="preserve">وجه تمایز هرمز: هزینه ساخت پایین، استفاده مجدد از قطعات، تعمیر محلی، پایش دست‌ساز و عرضه هم‌زمان چهار خدمت درآمدزا با قرارداد روشن.</w:t>
+        <w:t xml:space="preserve">ساخت داخلی زمانی مزیت اقتصادی دارد که هزینه تعمیر و توقف خدمت را بالا نبرد. برای هر بخش، هزینه ساخت، مصرف، مواد مصرفی و تعویض قطعات ثبت می‌شود تا صرفه‌جویی فقط به قیمت خرید محدود نماند.</w:t>
       </w:r>
     </w:p>
     <w:p>
@@ -5803,7 +5771,7 @@
           <w:rtl w:val="true"/>
           <w:lang w:bidi="fa-IR"/>
         </w:rPr>
-        <w:t xml:space="preserve">محدودیت طرح: ظرفیت و افزونگی کمتر و نیاز به اثبات دوام اجزای دست‌ساز؛ فروش ابتدا به مشتریانی انجام می‌شود که سطح خدمت پایلوت با نیازشان سازگار است.</w:t>
+        <w:t xml:space="preserve">برای شروع، خدماتی را می‌فروشیم که با ظرفیت موجود قابل پشتیبانی باشد. تعهد دسترس‌پذیری و زمان پاسخ‌گویی پس از آزمون تجهیزات نوشته می‌شود و از وعده ظرفیت یا پایداری اثبات‌نشده خودداری می‌کنیم.</w:t>
       </w:r>
     </w:p>
     <w:p>
@@ -5827,7 +5795,7 @@
           <w:rtl w:val="true"/>
           <w:lang w:bidi="fa-IR"/>
         </w:rPr>
-        <w:t xml:space="preserve">شاخص‌های مقایسه: سرمایه به ازای یونیت قابل فروش، هزینه ماهانه هر خدمت، مصرف برق، نرخ اشغال، رخداد و زمان رفع خرابی.</w:t>
+        <w:t xml:space="preserve">معیار فروش و توسعه، تعداد یونیت و منابع فروخته‌شده، حاشیه درآمد هر خدمت و هزینه ماهانه برق و ارتباط است. یک یونیت هم‌مکانی را هم‌زمان ظرفیت فروش سرور خودمان حساب نمی‌کنیم.</w:t>
       </w:r>
     </w:p>
     <w:p>
@@ -5851,7 +5819,7 @@
           <w:rtl w:val="true"/>
           <w:lang w:bidi="fa-IR"/>
         </w:rPr>
-        <w:t xml:space="preserve">اندازه بازار و سهم قابل دستیابی پس از مصاحبه و پیش‌فروش تعیین می‌شود؛ در این پیش‌نویس برآورد قطعی تعداد مشتری یا سود ارائه نمی‌شود.</w:t>
+        <w:t xml:space="preserve">راه‌اندازی و پشتیبانی تلفن اینترنتی می‌تواند پیش از تکمیل ظرفیت رک‌ها درآمد ایجاد کند. مشتریان این خدمت نیز برای میزبانی نرم‌افزار و سرور، مخاطب خدمات دیگر مجموعه خواهند بود.</w:t>
       </w:r>
     </w:p>
     <w:p>
@@ -5873,7 +5841,7 @@
           <w:rtl w:val="true"/>
           <w:lang w:bidi="fa-IR"/>
         </w:rPr>
-        <w:t xml:space="preserve">تعرفه از هزینه برق، ارتباط، نگهداری، استهلاک و پشتیبانی به‌علاوه حاشیه سود محاسبه می‌شود؛ نقطه سربه‌سر با ترکیب واقعی فروش چهار خدمت سنجیده خواهد شد.</w:t>
+        <w:t xml:space="preserve">در این مرحله، درآمد ماهانه و زمان بازگشت سرمایه هنوز قابل اتکا نیست. این دو عدد با تعرفه‌های استعلام‌شده، هزینه جاری محل و تعداد قراردادهای اولیه محاسبه می‌شود.</w:t>
       </w:r>
     </w:p>
     <w:p>
@@ -5971,7 +5939,7 @@
           <w:rtl w:val="true"/>
           <w:lang w:bidi="fa-IR"/>
         </w:rPr>
-        <w:t xml:space="preserve">هدف از استقرار، تبدیل ایده مرکز داده بسیار کم‌هزینه به نمونه آزموده و قابل فروش است؛ اولویت حمایت، کاهش هزینه فضای مناسب و آزمون‌های فنی است.</w:t>
+        <w:t xml:space="preserve">از مرکز رشد انتظار داریم در تأمین فضای ماندگار و مناسب برای اجرای نمونه کمک کند. جابه‌جایی رک، کابل، کف و سرمایش هزینه‌بر است؛ بهتر است محل از ابتدا امکان ادامه فعالیت داشته باشد.</w:t>
       </w:r>
     </w:p>
     <w:p>
@@ -5995,7 +5963,7 @@
           <w:rtl w:val="true"/>
           <w:lang w:bidi="fa-IR"/>
         </w:rPr>
-        <w:t xml:space="preserve">انتظارات: فضای پایدار و قابل تجهیز، تسهیل دسترسی به برق و اینترنت، آزمایشگاه برق و مکانیک و مشاوره آزمون کف، سرمایش و برق پشتیبان.</w:t>
+        <w:t xml:space="preserve">دسترسی به آزمایشگاه برق و مواد، برای آزمون ارت، پوشش اپوکسی، فیلتر و برق پشتیبان اهمیت دارد. اجاره یا استفاده مشترک از ابزار اندازه‌گیری، هزینه ساخت نمونه‌ها را کمتر می‌کند.</w:t>
       </w:r>
     </w:p>
     <w:p>
@@ -6019,7 +5987,7 @@
           <w:rtl w:val="true"/>
           <w:lang w:bidi="fa-IR"/>
         </w:rPr>
-        <w:t xml:space="preserve">معرفی مشتری پایلوت، مشاوره مدل کسب‌وکار و قرارداد خدمات، حمایت از مستندسازی دانش فنی و معرفی به تأمین‌کنندگان و سرمایه‌گذار.</w:t>
+        <w:t xml:space="preserve">معرفی به شرکت‌های مستقر برای اجرای آزمایشی خدمات و کمک در تدوین قرارداد و تأمین مالی، حمایت‌های دیگر موردنیاز ماست. بخش عمده نصب، برنامه‌نویسی و آزمایش‌های اولیه را تیم انجام می‌دهد.</w:t>
       </w:r>
     </w:p>
     <w:p>
@@ -6043,7 +6011,7 @@
           <w:rtl w:val="true"/>
           <w:lang w:bidi="fa-IR"/>
         </w:rPr>
-        <w:t xml:space="preserve">فضای حدود ۱۵ تا ۱۷ مترمربع مطرح‌شده در پیشنهاد قبلی، گزینه اولیه است؛ قابلیت استقرار و هزینه آن باید دوباره بررسی و تأیید شود.</w:t>
+        <w:t xml:space="preserve">اتاق رک ۱۸ مترمربع است؛ فضای باتری، تجهیزات تولید سرما و محل مخزن اطفا باید جداگانه بررسی شود. مساحت اتاق رک به‌تنهایی بیانگر کل فضای موردنیاز نیست.</w:t>
       </w:r>
     </w:p>
     <w:p>
@@ -6248,7 +6216,7 @@
           <w:rtl w:val="true"/>
           <w:lang w:bidi="fa-IR"/>
         </w:rPr>
-        <w:t xml:space="preserve">تجهیزات پایه: یک رک، دو سرور بازسازی‌شده متناسب با خدمات اختصاصی و مجازی، ذخیره‌ساز و نسخه پشتیبان، سوئیچ مدیریتی، روتر و تجهیزات تلفن اینترنتی.</w:t>
+        <w:t xml:space="preserve">برق: ارت مشترک ساختمان، تابلو حفاظت و توزیع و UPS. مطالعه فعلی UPS برای ۵۰ کیلووات خروجی و ۱۵ دقیقه پشتیبانی است؛ انتخاب نهایی باید با بار واقعی در سقف ۵۰ کیلووات کل مجموعه تطبیق یابد.</w:t>
       </w:r>
     </w:p>
     <w:p>
@@ -6272,7 +6240,7 @@
           <w:rtl w:val="true"/>
           <w:lang w:bidi="fa-IR"/>
         </w:rPr>
-        <w:t xml:space="preserve">برق: تابلو و حفاظت، ارت، توزیع برق رک، کابل‌کشی، بانک باتری خودرو، شارژر و مبدل؛ ظرفیت بر مبنای بار اندازه‌گیری‌شده تعیین می‌شود.</w:t>
+        <w:t xml:space="preserve">کف و هوا: اپوکسی و گرافیت، نوار مسی، فن، کانال و فیلتر دست‌ساز. طرح هوا برای ۲۰ کیلووات بار سرور و حدود ۷۲۰۰ مترمکعب بر ساعت است و هزینه تولید سرما را شامل نمی‌شود.</w:t>
       </w:r>
     </w:p>
     <w:p>
@@ -6296,7 +6264,7 @@
           <w:rtl w:val="true"/>
           <w:lang w:bidi="fa-IR"/>
         </w:rPr>
-        <w:t xml:space="preserve">محیط: پوشش آنتی‌استاتیک، رادیاتور خودرو، پمپ و قطعات قابل استفاده ماشین لباس‌شویی، فن، مسیر گردش هوا و فیلتر قابل تعویض.</w:t>
+        <w:t xml:space="preserve">پایش: ۱۲ حسگر دما و رطوبت، کنترلگر یا رابط شبکه و نرم‌افزار روی ماشین مجازی؛ دو تا سه آشکارساز دود، رابط اترنت و آژیر، با تغذیه UPS مشترک و بدون باتری مستقل.</w:t>
       </w:r>
     </w:p>
     <w:p>
@@ -6320,7 +6288,7 @@
           <w:rtl w:val="true"/>
           <w:lang w:bidi="fa-IR"/>
         </w:rPr>
-        <w:t xml:space="preserve">پایش و ایمنی: حسگر دما، رطوبت، دود و حرارت، کنترلگر، هشدار، تجهیزات اطفای مناسب، دوربین و کنترل دسترسی.</w:t>
+        <w:t xml:space="preserve">امنیت و اطفا: چهار دوربین، دستگاه ضبط و ورودی تشخیص چهره با خروج اضطراری؛ مخزن، پمپ، لوله و نازل با کنترل مستقل. جانمایی کانال، آشکارساز و نازل باید هماهنگ باشد.</w:t>
       </w:r>
     </w:p>
     <w:p>
@@ -6344,7 +6312,7 @@
           <w:rtl w:val="true"/>
           <w:lang w:bidi="fa-IR"/>
         </w:rPr>
-        <w:t xml:space="preserve">خدمات: اینترنت پایدار، نصب و پیکربندی، آزمون برق و حرارت و کف، ارزیابی ایمنی، ابزار کار و مواد مصرفی.</w:t>
+        <w:t xml:space="preserve">تجهیزات فروش: چهار رک با تجهیز تدریجی، سرور، ذخیره‌ساز، شبکه، اینترنت و تلفن اینترنتی؛ خرید پس از بررسی موجودی. فضای باتری، تجهیزات سرمایش و مخزن خارج از اتاق رک بررسی می‌شود.</w:t>
       </w:r>
     </w:p>
     <w:p>
@@ -6368,51 +6336,55 @@
           <w:rtl w:val="true"/>
           <w:lang w:bidi="fa-IR"/>
         </w:rPr>
-        <w:t xml:space="preserve">پنل خورشیدی و کنترلگر شارژ، اختیاری و خارج از پایلوت پایه است. پشتیبان‌گیری و امنیت شبکه از شروع بهره‌برداری پیش‌بینی می‌شود.</w:t>
-      </w:r>
-    </w:p>
-    <w:p>
-      <w:pPr>
-        <w:pStyle w:val="Normal"/>
-        <w:ind w:end="0"/>
-        <w:jc w:val="start"/>
-        <w:rPr>
-          <w:rFonts w:cs="B Zar"/>
-          <w:sz w:val="26"/>
-          <w:szCs w:val="26"/>
-          <w:lang w:bidi="fa-IR"/>
-        </w:rPr>
-      </w:pPr>
-      <w:r>
-        <w:rPr>
-          <w:rFonts w:cs="B Zar" w:hint="cs"/>
-          <w:sz w:val="26"/>
-          <w:szCs w:val="26"/>
-          <w:rtl w:val="true"/>
-          <w:lang w:bidi="fa-IR"/>
-        </w:rPr>
-      </w:r>
-    </w:p>
-    <w:p>
-      <w:pPr>
-        <w:pStyle w:val="Normal"/>
-        <w:ind w:end="0"/>
-        <w:jc w:val="start"/>
-        <w:rPr>
-          <w:rFonts w:cs="B Zar" w:hint="cs"/>
-          <w:sz w:val="26"/>
-          <w:szCs w:val="26"/>
-          <w:lang w:bidi="fa-IR"/>
-        </w:rPr>
-      </w:pPr>
-      <w:r>
-        <w:rPr>
-          <w:rFonts w:cs="B Zar" w:hint="cs"/>
-          <w:sz w:val="26"/>
-          <w:szCs w:val="26"/>
-          <w:rtl w:val="true"/>
-          <w:lang w:bidi="fa-IR"/>
-        </w:rPr>
+        <w:t xml:space="preserve">ارقام زیر از هشت مطالعه فنی همراه، به تاریخ ۱۳ اکتبر ۲۰۲۶، استخراج شده‌اند؛ واحد میلیون تومان است و ذخیره احتیاطی اضافه نشده. قیمت‌ها ترکیبی از مراجع فروش و فرض برآوردند و باید استعلام شوند.</w:t>
+      </w:r>
+    </w:p>
+    <w:p>
+      <w:pPr>
+        <w:pStyle w:val="Normal"/>
+        <w:ind w:end="0"/>
+        <w:jc w:val="start"/>
+        <w:rPr>
+          <w:rFonts w:cs="B Zar"/>
+          <w:sz w:val="26"/>
+          <w:szCs w:val="26"/>
+          <w:lang w:bidi="fa-IR"/>
+        </w:rPr>
+        <w:bidi w:val="1"/>
+      </w:pPr>
+      <w:r>
+        <w:rPr>
+          <w:rFonts w:cs="B Zar" w:hint="cs"/>
+          <w:sz w:val="26"/>
+          <w:szCs w:val="26"/>
+          <w:rtl w:val="true"/>
+          <w:lang w:bidi="fa-IR"/>
+        </w:rPr>
+        <w:t xml:space="preserve">کار شخصی تیم در پایش، اعلام دود و اجرای کف دستمزد نقدی ندارد؛ خدمات تخصصی و آزمون‌ها در ارقام باقی است. اقلام مشترک شبکه، کابل و ارت باید در فهرست خرید نهایی یک بار محاسبه شوند.</w:t>
+      </w:r>
+    </w:p>
+    <w:p>
+      <w:pPr>
+        <w:pStyle w:val="Normal"/>
+        <w:ind w:end="0"/>
+        <w:jc w:val="start"/>
+        <w:rPr>
+          <w:rFonts w:cs="B Zar" w:hint="cs"/>
+          <w:sz w:val="26"/>
+          <w:szCs w:val="26"/>
+          <w:lang w:bidi="fa-IR"/>
+        </w:rPr>
+        <w:bidi w:val="1"/>
+      </w:pPr>
+      <w:r>
+        <w:rPr>
+          <w:rFonts w:cs="B Zar" w:hint="cs"/>
+          <w:sz w:val="26"/>
+          <w:szCs w:val="26"/>
+          <w:rtl w:val="true"/>
+          <w:lang w:bidi="fa-IR"/>
+        </w:rPr>
+        <w:t xml:space="preserve">مطالعات همراه: پایش رک، ارت، گردش هوا، UPS، کف آنتی‌استاتیک، دوربین و کنترل ورودی، اعلام دود و اطفای حریق؛ شامل ریز قطعات، هزینه و روش اجرا.</w:t>
       </w:r>
     </w:p>
     <w:p>
@@ -6469,7 +6441,7 @@
           <w:rtl w:val="true"/>
           <w:lang w:bidi="fa-IR"/>
         </w:rPr>
-        <w:t xml:space="preserve">بودجه فرضی پایلوت بدون استعلام (میلیون تومان): دو سرور و ذخیره‌سازی ۴۰۰؛ رک، شبکه و تلفن اینترنتی ۱۰۰؛ برق و ارت ۶۰؛ برق پشتیبان دست‌ساز ۶۰؛ سرمایش و فیلتر ۵۰؛ کف ۳۰.</w:t>
+        <w:t xml:space="preserve">پایش ۱۲ نقطه با آردوینو و قطعات یدکی: ۳۷٫۳۱۸۵؛ ارت میله‌ای: ۱۹۲٫۱۱۵؛ گردش هوا و فیلتر با نصب و آزمون: ۳۱۹٫۵۸؛ کف دست‌ساز با آزمون: ۴۳٫۵ میلیون تومان.</w:t>
       </w:r>
     </w:p>
     <w:p>
@@ -6493,7 +6465,7 @@
           <w:rtl w:val="true"/>
           <w:lang w:bidi="fa-IR"/>
         </w:rPr>
-        <w:t xml:space="preserve">پایش و تشخیص و اطفای حریق ۴۰؛ دستمزد ساخت و نصب ۶۰؛ مواد مصرفی ۲۰؛ آزمون و خدمات آزمایشگاهی ۳۰؛ متفرقه و ذخیره احتیاطی ۵۰. جمع راه‌اندازی پایه: ۱٬۰۰۰ میلیون تومان.</w:t>
+        <w:t xml:space="preserve">دوربین و کنترل ورودی با نصب: ۲۵۹٫۵۷۶؛ اعلام دود دوحسگری: ۲۵٫۵۴۷۳؛ اطفای مخزنی، برآورد میانه: ۱۱۳۴ میلیون تومان. ارت حلقه‌ای ۲۱۹٫۸۹۵ و چاه صفحه‌ای ۲۵۰٫۱۳، گزینه‌های جایگزین ارت میله‌ای‌اند.</w:t>
       </w:r>
     </w:p>
     <w:p>
@@ -6517,7 +6489,7 @@
           <w:rtl w:val="true"/>
           <w:lang w:bidi="fa-IR"/>
         </w:rPr>
-        <w:t xml:space="preserve">سرمایه در گردش اولیه: ۱۵۰ میلیون تومان؛ جمع برنامه‌ریزی: ۱٬۱۵۰ میلیون تومان. ودیعه و اجاره محل، ارتقای انشعاب و پنل خورشیدی پس از استعلام جداگانه افزوده می‌شود.</w:t>
+        <w:t xml:space="preserve">جمع حسابی هفت بخش، پیش از حذف اقلام مشترک: ۲۰۱۱٫۶۳۶۸ میلیون تومان. UPS تجاری مطالعه موجود جداگانه ۱۰۰۲۰ میلیون تومان است؛ برای ۵۰ کیلووات خروجی با باتری ثابت، نه نمونه دست‌ساز با باتری خودرو. هزینه نهایی برق پشتیبان هنوز تعیین نشده است.</w:t>
       </w:r>
     </w:p>
     <w:p>
@@ -6541,7 +6513,7 @@
           <w:rtl w:val="true"/>
           <w:lang w:bidi="fa-IR"/>
         </w:rPr>
-        <w:t xml:space="preserve">هزینه جاری: نیروی انسانی، برق، اینترنت، اجاره، نگهداری، تعویض باتری و فیلتر و استهلاک. ارقام فوق فقط فرض بودجه‌ای برای بررسی است؛ مبلغ نهایی با فهرست قطعات و استعلام تعیین می‌شود.</w:t>
+        <w:t xml:space="preserve">این جمع، سرمایه کل پروژه نیست. سرور و رک، تولید سرما، آماده‌سازی محل، ارتقای انشعاب، مالیات و سرمایه در گردش جداگانه تعیین می‌شوند. برق، اینترنت، اجاره، نگهداری و تعویض باتری و فیلتر، هزینه جاری‌اند. پنل خورشیدی فعلاً در بودجه نیست.</w:t>
       </w:r>
     </w:p>
     <w:p>

</xml_diff>